<commit_message>
Add QwenPaw Skill/MCP, evidence pack, and live demo materials.
Keep secrets out of the repo: ignore .env, credentials, and local deploy logs; only ship redacted sessions and example env vars.

Co-authored-by: Cursor <cursoragent@cursor.com>
</commit_message>
<xml_diff>
--- a/docs/實踐文章_街知巷聞_EveryLaneMacau.docx
+++ b/docs/實踐文章_街知巷聞_EveryLaneMacau.docx
@@ -63,7 +63,7 @@
           <w:color w:val="6B6055"/>
           <w:sz w:val="19"/>
         </w:rPr>
-        <w:t>參賽者：SITINIEK（學號 dc227126）　·　方向：澳門文旅 × 舊區活化　·　2026 年</w:t>
+        <w:t>隊伍：愛拼才會贏　·　參賽者：施天益（SITINIEK，學號 dc227126）　·　2026 年</w:t>
       </w:r>
     </w:p>
     <w:p>
@@ -94,7 +94,7 @@
           <w:color w:val="2B2118"/>
           <w:sz w:val="21"/>
         </w:rPr>
-        <w:t>本作品基於阿里雲 Qwen 千問大模型與 QwenPaw 智能體理念，實作了一個可直接運行的網站「街知巷聞」。它不是聊天機械人，而是一個會規劃、調用 7 種工具、多步執行並能失敗自動恢復的ReAct 智能體（人設「阿濠」）。其核心創新是「舊區導流引擎」：在為遊客生成個人化深度遊行程時，主動把人流由大三巴、議事亭等熱點，分流到福隆新街、十月初五街等舊區老街與本地老字號，形成遊客、小店、城市三方共贏的商業模式。全程於網頁實時可視化，結果可逐項驗證。</w:t>
+        <w:t>本作品已在 QwenPaw 2.0.0 完成本地部署，完成阿里雲 Qwen Token Plan 相容配置，並以專用 Skill 與 MCP 實作一個可直接運行的網站「街知巷聞」。它不是聊天機械人，而是一個會規劃、調用 7 種工具、多步執行並能失敗自動恢復的ReAct 智能體（人設「阿濠」）。其核心創新是「舊區導流引擎」：在為遊客生成個人化深度遊行程時，主動把人流由大三巴、議事亭等熱點，分流到福隆新街、十月初五街等舊區老街與本地老字號，形成遊客、小店、城市三方共贏的商業模式。全程於網頁實時可視化，結果可逐項驗證。</w:t>
       </w:r>
     </w:p>
     <w:p>
@@ -287,7 +287,7 @@
           <w:color w:val="BE4A3A"/>
           <w:sz w:val="30"/>
         </w:rPr>
-        <w:t>三、　系統架構（對標 QwenPaw 五層）</w:t>
+        <w:t>三、　系統架構（實際部署 QwenPaw Skill + MCP）</w:t>
       </w:r>
     </w:p>
     <w:tbl>
@@ -532,7 +532,7 @@
                 <w:color w:val="2B2118"/>
                 <w:sz w:val="20"/>
               </w:rPr>
-              <w:t>FastAPI 應用，/api/plan 串流端點</w:t>
+              <w:t>QwenPaw 2.0 Console + FastAPI /api/plan SSE</w:t>
             </w:r>
           </w:p>
         </w:tc>
@@ -559,7 +559,7 @@
                 <w:color w:val="2B2118"/>
                 <w:sz w:val="20"/>
               </w:rPr>
-              <w:t>Agent 運行時 / FastAPI app</w:t>
+              <w:t>Agent 運行時</w:t>
             </w:r>
           </w:p>
         </w:tc>
@@ -618,7 +618,7 @@
                 <w:color w:val="2B2118"/>
                 <w:sz w:val="20"/>
               </w:rPr>
-              <w:t>ReAct 迴圈（思考-行動-觀察）+ 失敗恢復</w:t>
+              <w:t>EveryLane Skill + Plan Mode + ReAct + 失敗恢復</w:t>
             </w:r>
           </w:p>
         </w:tc>
@@ -645,7 +645,7 @@
                 <w:color w:val="2B2118"/>
                 <w:sz w:val="20"/>
               </w:rPr>
-              <w:t>QwenPawAgent / ReAct 核心</w:t>
+              <w:t>QwenPaw Agent / Skills</w:t>
             </w:r>
           </w:p>
         </w:tc>
@@ -704,7 +704,7 @@
                 <w:color w:val="2B2118"/>
                 <w:sz w:val="20"/>
               </w:rPr>
-              <w:t>7 種工具，統一 function-calling schema</w:t>
+              <w:t>stdio MCP：7 種工具 + 1 個流程比較工具</w:t>
             </w:r>
           </w:p>
         </w:tc>
@@ -731,7 +731,7 @@
                 <w:color w:val="2B2118"/>
                 <w:sz w:val="20"/>
               </w:rPr>
-              <w:t>工具 / Toolkit / MCP</w:t>
+              <w:t>MCP 工具層</w:t>
             </w:r>
           </w:p>
         </w:tc>
@@ -790,7 +790,7 @@
                 <w:color w:val="2B2118"/>
                 <w:sz w:val="20"/>
               </w:rPr>
-              <w:t>Qwen（百煉 OpenAI 相容）/ 離線雙腦</w:t>
+              <w:t>Token Plan qwen3.7-plus 配置就緒 / 網站穩定示範引擎</w:t>
             </w:r>
           </w:p>
         </w:tc>
@@ -817,7 +817,7 @@
                 <w:color w:val="2B2118"/>
                 <w:sz w:val="20"/>
               </w:rPr>
-              <w:t>雲端模型供應商 / 模型路由</w:t>
+              <w:t>模型供應商 / 路由</w:t>
             </w:r>
           </w:p>
         </w:tc>
@@ -827,6 +827,65 @@
       <w:pPr>
         <w:spacing w:after="40"/>
       </w:pPr>
+    </w:p>
+    <w:p>
+      <w:pPr>
+        <w:keepNext/>
+        <w:keepLines/>
+        <w:spacing w:before="80" w:after="40"/>
+        <w:jc w:val="center"/>
+      </w:pPr>
+      <w:r>
+        <w:drawing>
+          <wp:inline xmlns:a="http://schemas.openxmlformats.org/drawingml/2006/main" xmlns:pic="http://schemas.openxmlformats.org/drawingml/2006/picture">
+            <wp:extent cx="5806440" cy="4032250"/>
+            <wp:docPr id="2" name="Picture 2"/>
+            <wp:cNvGraphicFramePr>
+              <a:graphicFrameLocks noChangeAspect="1"/>
+            </wp:cNvGraphicFramePr>
+            <a:graphic>
+              <a:graphicData uri="http://schemas.openxmlformats.org/drawingml/2006/picture">
+                <pic:pic>
+                  <pic:nvPicPr>
+                    <pic:cNvPr id="0" name="03_everylane_mcp_connected.png"/>
+                    <pic:cNvPicPr/>
+                  </pic:nvPicPr>
+                  <pic:blipFill>
+                    <a:blip r:embed="rId10"/>
+                    <a:stretch>
+                      <a:fillRect/>
+                    </a:stretch>
+                  </pic:blipFill>
+                  <pic:spPr>
+                    <a:xfrm>
+                      <a:off x="0" y="0"/>
+                      <a:ext cx="5806440" cy="4032250"/>
+                    </a:xfrm>
+                    <a:prstGeom prst="rect"/>
+                  </pic:spPr>
+                </pic:pic>
+              </a:graphicData>
+            </a:graphic>
+          </wp:inline>
+        </w:drawing>
+      </w:r>
+    </w:p>
+    <w:p>
+      <w:pPr>
+        <w:keepLines/>
+        <w:spacing w:before="0" w:after="160"/>
+        <w:jc w:val="center"/>
+      </w:pPr>
+      <w:r>
+        <w:rPr>
+          <w:rFonts w:ascii="Microsoft JhengHei" w:hAnsi="Microsoft JhengHei" w:eastAsia="Microsoft JhengHei"/>
+          <w:b w:val="0"/>
+          <w:i/>
+          <w:color w:val="6B6055"/>
+          <w:sz w:val="17"/>
+        </w:rPr>
+        <w:t>圖：QwenPaw 中 EveryLane Macau Tools MCP 客戶端已實際連接</w:t>
+      </w:r>
     </w:p>
     <w:p>
       <w:r>
@@ -1507,7 +1566,7 @@
         <w:drawing>
           <wp:inline xmlns:a="http://schemas.openxmlformats.org/drawingml/2006/main" xmlns:pic="http://schemas.openxmlformats.org/drawingml/2006/picture">
             <wp:extent cx="3246120" cy="5234368"/>
-            <wp:docPr id="2" name="Picture 2"/>
+            <wp:docPr id="3" name="Picture 3"/>
             <wp:cNvGraphicFramePr>
               <a:graphicFrameLocks noChangeAspect="1"/>
             </wp:cNvGraphicFramePr>
@@ -1519,7 +1578,7 @@
                     <pic:cNvPicPr/>
                   </pic:nvPicPr>
                   <pic:blipFill>
-                    <a:blip r:embed="rId10"/>
+                    <a:blip r:embed="rId11"/>
                     <a:stretch>
                       <a:fillRect/>
                     </a:stretch>
@@ -1568,7 +1627,7 @@
           <w:color w:val="2C5E86"/>
           <w:sz w:val="23"/>
         </w:rPr>
-        <w:t>▎在線 / 離線雙腦（穩健性設計）</w:t>
+        <w:t>▎Token Plan / 穩定示範雙模式（穩健性設計）</w:t>
       </w:r>
     </w:p>
     <w:p>
@@ -1583,7 +1642,7 @@
           <w:color w:val="2B2118"/>
           <w:sz w:val="21"/>
         </w:rPr>
-        <w:t>設定百煉 API Key 時由真實 Qwen 驅動；未設定時切換到「離線示範引擎」——它調用同一套真實工具、用同一份真實數據完成規劃與失敗恢復，確保網站任何環境都能完整演示，亦避免路演時受網絡影響。二者共用同一個確定性「行程組裝器」，保證輸出穩定可驗證。</w:t>
+        <w:t>QwenPaw 與網站可透過 OpenAI 相容協議接入主辦方 Token Plan；未設定本機 Key 或網絡異常時，網站切換到穩定示範引擎，仍使用同一知識庫和輸出結構，確保路演不翻車。Key 只存於 QwenPaw 密鑰庫或 Git 忽略的 .env，任何截圖均不展示憑證。</w:t>
       </w:r>
     </w:p>
     <w:p>
@@ -1632,7 +1691,7 @@
           <w:color w:val="2B2118"/>
           <w:sz w:val="21"/>
         </w:rPr>
-        <w:t>以程式抓取 Wikipedia / Wikimedia Commons 的真實坐標與相片（公開授權），坐標用於真實步行距離計算；</w:t>
+        <w:t>以程式抓取 Wikipedia / Wikimedia Commons 的真實坐標與相片（公開授權）；步行以坐標直線距離加 25% 舊城巷道係數估算，介面明確提示並預留道路導航接口；</w:t>
       </w:r>
     </w:p>
     <w:p>
@@ -2015,7 +2074,7 @@
         <w:drawing>
           <wp:inline xmlns:a="http://schemas.openxmlformats.org/drawingml/2006/main" xmlns:pic="http://schemas.openxmlformats.org/drawingml/2006/picture">
             <wp:extent cx="5806440" cy="3277413"/>
-            <wp:docPr id="3" name="Picture 3"/>
+            <wp:docPr id="4" name="Picture 4"/>
             <wp:cNvGraphicFramePr>
               <a:graphicFrameLocks noChangeAspect="1"/>
             </wp:cNvGraphicFramePr>
@@ -2027,7 +2086,7 @@
                     <pic:cNvPicPr/>
                   </pic:nvPicPr>
                   <pic:blipFill>
-                    <a:blip r:embed="rId11"/>
+                    <a:blip r:embed="rId12"/>
                     <a:stretch>
                       <a:fillRect/>
                     </a:stretch>

</xml_diff>